<commit_message>
Add PDF version of Algorithm Analysis report
Exported and uploaded JLiu_Algorithm_Analysis_COMP-258.pdf to analysis/ folder for direct in-browser rendering and grading.
</commit_message>
<xml_diff>
--- a/COMP258_EfficiencyAnalysis/analysis/JLiu_Algorithm_Analysis_COMP-258.docx
+++ b/COMP258_EfficiencyAnalysis/analysis/JLiu_Algorithm_Analysis_COMP-258.docx
@@ -23,7 +23,20 @@
         <w:spacing w:after="0"/>
       </w:pPr>
       <w:r>
-        <w:t>Program: Business Information Systems</w:t>
+        <w:t>Program: Business</w:t>
+      </w:r>
+      <w:r>
+        <w:rPr>
+          <w:sz w:val="28"/>
+          <w:szCs w:val="28"/>
+        </w:rPr>
+        <w:t xml:space="preserve"> </w:t>
+      </w:r>
+      <w:r>
+        <w:t xml:space="preserve">Information </w:t>
+      </w:r>
+      <w:r>
+        <w:t>Systems</w:t>
       </w:r>
     </w:p>
     <w:p>
@@ -85,13 +98,14 @@
       <w:r>
         <w:t xml:space="preserve">Provide an analysis of the two algorithms. Which has the worst case run time? Explain your answer using an example. Provide an approximate number of operations, for both methods, for a collection of size </w:t>
       </w:r>
-      <w:r>
-        <w:rPr>
-          <w:i/>
-          <w:iCs/>
-        </w:rPr>
-        <w:t>n</w:t>
-      </w:r>
+      <m:oMath>
+        <m:r>
+          <w:rPr>
+            <w:rFonts w:ascii="Cambria Math" w:hAnsi="Cambria Math"/>
+          </w:rPr>
+          <m:t>n</m:t>
+        </m:r>
+      </m:oMath>
       <w:r>
         <w:t>. Provide a graph of the comparison. Place this in an “analysis” folder in your project.</w:t>
       </w:r>

</xml_diff>